<commit_message>
docs(report): Ch2, Ch3 and Ch4 describe the API and frontend as planned, matching Ch8
Co-Authored-By: Claude Opus 5.5 <noreply@anthropic.com>
</commit_message>
<xml_diff>
--- a/docs/project_report/final_report.docx
+++ b/docs/project_report/final_report.docx
@@ -578,7 +578,7 @@
         <w:t xml:space="preserve"> </w:t>
       </w:r>
       <w:r>
-        <w:t xml:space="preserve">A REST API exposes the published results, and a web frontend built on it lets developers browse workloads, view their recommendations and compare policies. Figure 2.1 shows the overall architecture.</w:t>
+        <w:t xml:space="preserve">A planned REST API will expose the published results, and a web frontend built on it will let developers browse workloads, view their recommendations and compare policies. Figure 2.1 shows the overall architecture.</w:t>
       </w:r>
     </w:p>
     <w:p>
@@ -1126,7 +1126,7 @@
         <w:pStyle w:val="FirstParagraph"/>
       </w:pPr>
       <w:r>
-        <w:t xml:space="preserve">Every stage writes its outputs as files, and the checksums of the inputs, the code version and the library versions are recorded per stage on Alibaba and in the decision manifest on Google, so any result can be traced to the data and code that produced it. The artifact repository holds these outputs, from canonical views to final results. A REST API exposes the published recommendations and evaluation results, and a web frontend built on it lets developers browse workloads, view their recommendations and compare policies. The presentation layer only reads published results; it does not run the pipeline or change any artifact.</w:t>
+        <w:t xml:space="preserve">Every stage writes its outputs as files, and the checksums of the inputs, the code version and the library versions are recorded per stage on Alibaba and in the decision manifest on Google, so any result can be traced to the data and code that produced it. The artifact repository holds these outputs, from canonical views to final results. A planned REST API will expose the published recommendations and evaluation results, and a web frontend built on it will let developers browse workloads, view their recommendations and compare policies (Section 8.3). The presentation layer will only read published results; it will not run the pipeline or change any artifact.</w:t>
       </w:r>
     </w:p>
     <w:p>
@@ -2337,7 +2337,7 @@
         <w:pStyle w:val="BodyText"/>
       </w:pPr>
       <w:r>
-        <w:t xml:space="preserve">The presentation layer is built from two components. A REST API serves the recommendations and evaluation results held in the artifact repository over HTTP, returning them in JSON so that any client can use them. A web frontend built on this API presents the results to developers in a browser, allowing them to look up a workload, see its recommended CPU and memory, and compare the policies. The presentation layer only reads published results; it does not run the pipeline or modify any artifact.</w:t>
+        <w:t xml:space="preserve">The presentation layer is planned as two components (Section 8.3). A REST API will serve the recommendations and evaluation results held in the artifact repository over HTTP, returning them in JSON so that any client can use them. A web frontend built on this API will present the results to developers in a browser, allowing them to look up a workload, see its recommended CPU and memory, and compare the policies. The presentation layer will only read published results; it will not run the pipeline or modify any artifact.</w:t>
       </w:r>
     </w:p>
     <w:p>
@@ -3271,7 +3271,7 @@
         <w:pStyle w:val="BodyText"/>
       </w:pPr>
       <w:r>
-        <w:t xml:space="preserve">A REST API exposes the published recommendations and evaluation results over HTTP in JSON, organized by dataset, workload and policy, and a web frontend built on it lets developers look up a workload, see its recommended CPU and memory under each policy and compare policies. The API is read-only: it serves only published, locked results and never runs the pipeline or modifies an artifact, so developers see exactly what was evaluated. Because it depends only on published files, it is decoupled from the pipeline and can be developed and deployed independently. Units and dataset labels, such as the fact that Alibaba CPU results describe average usage, are returned with each result, so the frontend never presents a value without the information needed to interpret it. Deployment is described in Chapter 8.</w:t>
+        <w:t xml:space="preserve">The presentation layer is designed but not yet implemented (Section 8.3). A REST API exposes the published recommendations and evaluation results over HTTP in JSON, organized by dataset, workload and policy, and a web frontend built on it lets developers look up a workload, see its recommended CPU and memory under each policy and compare policies. The API is read-only: it serves only published, locked results and never runs the pipeline or modifies an artifact, so developers see exactly what was evaluated. Because it depends only on published files, it is decoupled from the pipeline and can be developed and deployed independently. Units and dataset labels, such as the fact that Alibaba CPU results describe average usage, are returned with each result, so the frontend never presents a value without the information needed to interpret it. Deployment is described in Chapter 8.</w:t>
       </w:r>
     </w:p>
     <w:p>

</xml_diff>

<commit_message>
docs(report): one-paragraph 240-word abstract for the IEEE template; keywords in alphabetical order
Co-Authored-By: Claude Opus 5.5 <noreply@anthropic.com>
</commit_message>
<xml_diff>
--- a/docs/project_report/final_report.docx
+++ b/docs/project_report/final_report.docx
@@ -56,23 +56,7 @@
         <w:pStyle w:val="FirstParagraph"/>
       </w:pPr>
       <w:r>
-        <w:t xml:space="preserve">Cloud and AI clusters often experience inefficient resource utilization because users must estimate CPU and memory requirements before execution. To avoid under-provisioning, which can lead to out-of-memory events, evictions, or job failures, users tend to request more resources than their workloads actually need. This results in over-provisioning and unused resource capacity in shared clusters. Although existing resource management approaches aim to improve resource efficiency, many operate at runtime, require scheduler modifications, or depend on online experimentation rather than providing recommendations before job submission.</w:t>
-      </w:r>
-    </w:p>
-    <w:p>
-      <w:pPr>
-        <w:pStyle w:val="BodyText"/>
-      </w:pPr>
-      <w:r>
-        <w:t xml:space="preserve">This project presents TraceAdvisor, an offline, trace-driven system that generates pre-execution CPU and memory recommendations for recurring cluster workloads. The framework uses historical execution data to identify recurring workloads, reconstruct execution histories, and analyze resource usage patterns. TraceAdvisor compares original resource requests with historical statistical baselines, machine learning predictions, and a Hybrid recommendation policy. Historical statistics, including mean usage and high-percentile estimates such as P90, P95, and P99, help account for variations in resource demand. The Hybrid policy takes the larger of the machine learning prediction and a historical percentile, so that the prediction can raise but never lower the historical safeguard.</w:t>
-      </w:r>
-    </w:p>
-    <w:p>
-      <w:pPr>
-        <w:pStyle w:val="BodyText"/>
-      </w:pPr>
-      <w:r>
-        <w:t xml:space="preserve">TraceAdvisor uses Google ClusterData 2019 as its primary dataset and Alibaba GPU 2020 as a second production dataset covering recurring machine learning workloads. The framework applies dataset-specific processing and evaluation methods to account for differences in workload structure and available CPU and memory measurements. Recommendations are evaluated through chronological trace replay using violation rate, shortfall, waste, and utilization to examine the trade-off between over-provisioning and under-provisioning, with every selection made on a validation period before a held-out test period is scored once. On the Google test period, the Hybrid policy had the lowest rate of CPU or memory violations, 12.36%, compared with 14.67% for the 99th percentile and 54.47% for the original requests. On Alibaba GPU 2020, it reduced the violation rate of its 99th-percentile safeguard from 6.45% to 3.77% for average CPU usage and from 3.44% to 3.15% for memory at almost the same memory waste. By using historical workload behavior without requiring changes to existing schedulers, TraceAdvisor provides a practical approach to supporting resource allocation decisions before execution.</w:t>
+        <w:t xml:space="preserve">Cloud and AI clusters often use resources inefficiently because users must estimate CPU and memory requirements before execution. To avoid out-of-memory events, evictions, or job failures, users tend to request more than their workloads need, leaving capacity unused. Existing approaches often operate at runtime, require scheduler modifications, or depend on online experimentation. This project presents TraceAdvisor, an offline, trace-driven system that generates pre-execution CPU and memory recommendations for recurring cluster workloads. TraceAdvisor maps each trace into a shared canonical model through dataset-specific adapters, reconstructs the execution history of recurring workloads, and compares the original requests with historical mean and percentile baselines, machine learning predictions, and a Hybrid policy that takes the larger of the machine learning prediction and a historical percentile, so that the prediction can raise but never lower the historical safeguard. Recommendations are evaluated through chronological trace replay using violation rate, shortfall, waste, and utilization, with every selection made on a validation period before a held-out test period is scored once. On Google ClusterData 2019, the Hybrid policy had the lowest rate of CPU or memory violations, 12.36%, compared with 14.67% for the 99th percentile and 54.47% for the original requests. On Alibaba GPU 2020, it reduced the violation rate of its 99th-percentile safeguard from 6.45% to 3.77% for average CPU usage and from 3.44% to 3.15% for memory at almost the same memory waste. TraceAdvisor thus supports resource allocation decisions before execution without changes to existing schedulers.</w:t>
       </w:r>
     </w:p>
     <w:p>
@@ -90,7 +74,7 @@
         <w:t xml:space="preserve"> </w:t>
       </w:r>
       <w:r>
-        <w:t xml:space="preserve">cluster workloads, CPU and memory recommendations, resource allocation, production traces, machine learning</w:t>
+        <w:t xml:space="preserve">cluster workloads, CPU and memory recommendations, machine learning, production traces, resource allocation</w:t>
       </w:r>
     </w:p>
     <w:p>

</xml_diff>

<commit_message>
docs(report): readable figures (vector PDFs, redrawn diagrams), full-width figures, lists of figures and tables
- Figures 2.1, 4.1, 4.3, 4.4 redrawn at print size (diagrams/make_diagrams.py), PDF + PNG;
  REST API and frontend marked planned
- Results plots also saved as PDF by make_results_figures.py (PNGs unchanged)
- LaTeX uses the PDFs, sets every figure at full page width, and adds the
  List of Figures and List of Tables

Co-Authored-By: Claude Opus 5.5 <noreply@anthropic.com>
</commit_message>
<xml_diff>
--- a/docs/project_report/final_report.docx
+++ b/docs/project_report/final_report.docx
@@ -572,7 +572,7 @@
       <w:r>
         <w:drawing>
           <wp:inline>
-            <wp:extent cx="5334000" cy="1870982"/>
+            <wp:extent cx="5334000" cy="3086100"/>
             <wp:effectExtent b="0" l="0" r="0" t="0"/>
             <wp:docPr descr="" title="" id="23" name="Picture"/>
             <a:graphic>
@@ -593,7 +593,7 @@
                   <pic:spPr bwMode="auto">
                     <a:xfrm>
                       <a:off x="0" y="0"/>
-                      <a:ext cx="5334000" cy="1870982"/>
+                      <a:ext cx="5334000" cy="3086100"/>
                     </a:xfrm>
                     <a:prstGeom prst="rect">
                       <a:avLst/>
@@ -2388,7 +2388,7 @@
       <w:r>
         <w:drawing>
           <wp:inline>
-            <wp:extent cx="5334000" cy="1939017"/>
+            <wp:extent cx="5334000" cy="2933700"/>
             <wp:effectExtent b="0" l="0" r="0" t="0"/>
             <wp:docPr descr="" title="" id="44" name="Picture"/>
             <a:graphic>
@@ -2409,7 +2409,7 @@
                   <pic:spPr bwMode="auto">
                     <a:xfrm>
                       <a:off x="0" y="0"/>
-                      <a:ext cx="5334000" cy="1939017"/>
+                      <a:ext cx="5334000" cy="2933700"/>
                     </a:xfrm>
                     <a:prstGeom prst="rect">
                       <a:avLst/>
@@ -3093,7 +3093,7 @@
       <w:r>
         <w:drawing>
           <wp:inline>
-            <wp:extent cx="5334000" cy="966107"/>
+            <wp:extent cx="5334000" cy="2095500"/>
             <wp:effectExtent b="0" l="0" r="0" t="0"/>
             <wp:docPr descr="" title="" id="62" name="Picture"/>
             <a:graphic>
@@ -3114,7 +3114,7 @@
                   <pic:spPr bwMode="auto">
                     <a:xfrm>
                       <a:off x="0" y="0"/>
-                      <a:ext cx="5334000" cy="966107"/>
+                      <a:ext cx="5334000" cy="2095500"/>
                     </a:xfrm>
                     <a:prstGeom prst="rect">
                       <a:avLst/>
@@ -3176,7 +3176,7 @@
       <w:r>
         <w:drawing>
           <wp:inline>
-            <wp:extent cx="5334000" cy="483053"/>
+            <wp:extent cx="5334000" cy="1333500"/>
             <wp:effectExtent b="0" l="0" r="0" t="0"/>
             <wp:docPr descr="" title="" id="66" name="Picture"/>
             <a:graphic>
@@ -3197,7 +3197,7 @@
                   <pic:spPr bwMode="auto">
                     <a:xfrm>
                       <a:off x="0" y="0"/>
-                      <a:ext cx="5334000" cy="483053"/>
+                      <a:ext cx="5334000" cy="1333500"/>
                     </a:xfrm>
                     <a:prstGeom prst="rect">
                       <a:avLst/>

</xml_diff>

<commit_message>
docs(report): fixes from the first Overleaf PDF
- wrap long command lines so they fit one column (VIII-B)
- 'This chapter' reads 'This section' in the IEEE layout
- Ch5 5.6 describes the API and frontend as planned
- single plots (Figures 4.2, 7.1) at 60% of the page width
- Ch6 no longer names the internal Task 8

Co-Authored-By: Claude Opus 5.5 <noreply@anthropic.com>
</commit_message>
<xml_diff>
--- a/docs/project_report/final_report.docx
+++ b/docs/project_report/final_report.docx
@@ -7767,7 +7767,7 @@
         <w:t xml:space="preserve"> </w:t>
       </w:r>
       <w:r>
-        <w:t xml:space="preserve">(Table 3.1). The REST API serves the published recommendation and result files as JSON, organized by dataset, workload and policy and labelled with their units, and the web frontend presents them to developers; neither component runs a pipeline stage or modifies an artifact (Section 4.4).</w:t>
+        <w:t xml:space="preserve">(Table 3.1). A planned REST API will serve the published recommendation and result files as JSON, organized by dataset, workload and policy and labelled with their units, and a web frontend will present them to developers; neither component will run a pipeline stage or modify an artifact (Sections 4.4 and 8.3).</w:t>
       </w:r>
     </w:p>
     <w:p>
@@ -8196,7 +8196,7 @@
         <w:t xml:space="preserve"> </w:t>
       </w:r>
       <w:r>
-        <w:t xml:space="preserve">file with its outputs, and each later stage verifies the files it reads against that list before using them; the target builder also checks the row counts and column order of the canonical tables. A file altered, truncated or regenerated after a stage completed therefore stops the next stage. The independent verification planned in Task 8, a separate script that re-validates every artifact and reproduces the pipeline in a fresh environment, was not completed; the evidence for the Alibaba pipeline is therefore the per-stage verification above, the end-to-end tests of Section 6.2 and the logged final run.</w:t>
+        <w:t xml:space="preserve">file with its outputs, and each later stage verifies the files it reads against that list before using them; the target builder also checks the row counts and column order of the canonical tables. A file altered, truncated or regenerated after a stage completed therefore stops the next stage. A planned independent verification, a separate script that re-validates every artifact and reproduces the pipeline in a fresh environment, was not completed; the evidence for the Alibaba pipeline is therefore the per-stage verification above, the end-to-end tests of Section 6.2 and the logged final run.</w:t>
       </w:r>
     </w:p>
     <w:p>

</xml_diff>